<commit_message>
Update templates: Đề nghị chuyển khoản, hoàn ứng, thanh toán, tạm ứng, đề xuất vật tư
</commit_message>
<xml_diff>
--- a/templates/Đề nghị chuyển khoản.docx
+++ b/templates/Đề nghị chuyển khoản.docx
@@ -37,20 +37,22 @@
         <w:t>GIẤY ĐỀ NGHỊ CHUYỂN KHOẢN</w:t>
       </w:r>
     </w:p>
-    <w:p/>
+    <w:p>
+      <w:pPr>
+        <w:spacing w:line="312" w:lineRule="auto"/>
+        <w:jc w:val="center"/>
+        <w:rPr>
+          <w:b/>
+          <w:bCs/>
+          <w:sz w:val="32"/>
+        </w:rPr>
+      </w:pPr>
+    </w:p>
     <w:tbl>
       <w:tblPr>
         <w:tblStyle w:val="4"/>
         <w:tblW w:w="10490" w:type="dxa"/>
-        <w:tblInd w:w="-176" w:type="dxa"/>
-        <w:tblBorders>
-          <w:top w:val="single" w:color="auto" w:sz="4" w:space="0"/>
-          <w:left w:val="single" w:color="auto" w:sz="4" w:space="0"/>
-          <w:bottom w:val="single" w:color="auto" w:sz="4" w:space="0"/>
-          <w:right w:val="single" w:color="auto" w:sz="4" w:space="0"/>
-          <w:insideH w:val="single" w:color="auto" w:sz="4" w:space="0"/>
-          <w:insideV w:val="single" w:color="auto" w:sz="4" w:space="0"/>
-        </w:tblBorders>
+        <w:jc w:val="center"/>
         <w:tblLayout w:type="fixed"/>
         <w:tblCellMar>
           <w:top w:w="0" w:type="dxa"/>
@@ -60,25 +62,16 @@
         </w:tblCellMar>
       </w:tblPr>
       <w:tblGrid>
-        <w:gridCol w:w="2411"/>
-        <w:gridCol w:w="991"/>
-        <w:gridCol w:w="143"/>
-        <w:gridCol w:w="1417"/>
-        <w:gridCol w:w="1985"/>
-        <w:gridCol w:w="850"/>
-        <w:gridCol w:w="2410"/>
-        <w:gridCol w:w="283"/>
+        <w:gridCol w:w="176"/>
+        <w:gridCol w:w="2235"/>
+        <w:gridCol w:w="1451"/>
+        <w:gridCol w:w="1100"/>
+        <w:gridCol w:w="2835"/>
+        <w:gridCol w:w="2019"/>
+        <w:gridCol w:w="674"/>
       </w:tblGrid>
       <w:tr>
         <w:tblPrEx>
-          <w:tblBorders>
-            <w:top w:val="single" w:color="auto" w:sz="4" w:space="0"/>
-            <w:left w:val="single" w:color="auto" w:sz="4" w:space="0"/>
-            <w:bottom w:val="single" w:color="auto" w:sz="4" w:space="0"/>
-            <w:right w:val="single" w:color="auto" w:sz="4" w:space="0"/>
-            <w:insideH w:val="single" w:color="auto" w:sz="4" w:space="0"/>
-            <w:insideV w:val="single" w:color="auto" w:sz="4" w:space="0"/>
-          </w:tblBorders>
           <w:tblCellMar>
             <w:top w:w="0" w:type="dxa"/>
             <w:left w:w="108" w:type="dxa"/>
@@ -87,47 +80,52 @@
           </w:tblCellMar>
         </w:tblPrEx>
         <w:trPr>
+          <w:gridBefore w:val="1"/>
           <w:gridAfter w:val="1"/>
-          <w:wAfter w:w="283" w:type="dxa"/>
+          <w:wBefore w:w="176" w:type="dxa"/>
+          <w:wAfter w:w="674" w:type="dxa"/>
+          <w:jc w:val="center"/>
         </w:trPr>
         <w:tc>
           <w:tcPr>
-            <w:tcW w:w="3545" w:type="dxa"/>
-            <w:gridSpan w:val="3"/>
-            <w:tcBorders>
-              <w:top w:val="nil"/>
-              <w:left w:val="nil"/>
-              <w:bottom w:val="nil"/>
-              <w:right w:val="nil"/>
-            </w:tcBorders>
+            <w:tcW w:w="3686" w:type="dxa"/>
+            <w:gridSpan w:val="2"/>
             <w:noWrap w:val="0"/>
             <w:vAlign w:val="top"/>
           </w:tcPr>
           <w:p>
             <w:pPr>
+              <w:tabs>
+                <w:tab w:val="left" w:pos="630"/>
+                <w:tab w:val="left" w:pos="6840"/>
+                <w:tab w:val="left" w:pos="7200"/>
+                <w:tab w:val="left" w:pos="9450"/>
+              </w:tabs>
               <w:spacing w:line="360" w:lineRule="auto"/>
-              <w:ind w:left="142"/>
-            </w:pPr>
-            <w:r>
-              <w:t xml:space="preserve">Họ tên người ĐN chuyển khoản </w:t>
+              <w:rPr>
+                <w:lang w:val="fr-FR"/>
+              </w:rPr>
+            </w:pPr>
+            <w:r>
+              <w:t>Họ tên người ĐN thanh toán</w:t>
             </w:r>
           </w:p>
         </w:tc>
         <w:tc>
           <w:tcPr>
-            <w:tcW w:w="6662" w:type="dxa"/>
-            <w:gridSpan w:val="4"/>
-            <w:tcBorders>
-              <w:top w:val="nil"/>
-              <w:left w:val="nil"/>
-              <w:bottom w:val="nil"/>
-              <w:right w:val="nil"/>
-            </w:tcBorders>
+            <w:tcW w:w="5954" w:type="dxa"/>
+            <w:gridSpan w:val="3"/>
             <w:noWrap w:val="0"/>
             <w:vAlign w:val="top"/>
           </w:tcPr>
           <w:p>
             <w:pPr>
+              <w:tabs>
+                <w:tab w:val="left" w:pos="630"/>
+                <w:tab w:val="left" w:pos="6840"/>
+                <w:tab w:val="left" w:pos="7200"/>
+                <w:tab w:val="left" w:pos="9450"/>
+              </w:tabs>
               <w:spacing w:line="360" w:lineRule="auto"/>
               <w:rPr>
                 <w:rFonts w:hint="default" w:ascii="Times New Roman" w:hAnsi="Times New Roman" w:cs="Times New Roman"/>
@@ -152,21 +150,13 @@
                 <w:sz w:val="24"/>
                 <w:szCs w:val="24"/>
               </w:rPr>
-              <w:t>{nguoi_de_xuat}</w:t>
+              <w:t>{ho_ten_nguoi_de_nghi}</w:t>
             </w:r>
           </w:p>
         </w:tc>
       </w:tr>
       <w:tr>
         <w:tblPrEx>
-          <w:tblBorders>
-            <w:top w:val="single" w:color="auto" w:sz="4" w:space="0"/>
-            <w:left w:val="single" w:color="auto" w:sz="4" w:space="0"/>
-            <w:bottom w:val="single" w:color="auto" w:sz="4" w:space="0"/>
-            <w:right w:val="single" w:color="auto" w:sz="4" w:space="0"/>
-            <w:insideH w:val="single" w:color="auto" w:sz="4" w:space="0"/>
-            <w:insideV w:val="single" w:color="auto" w:sz="4" w:space="0"/>
-          </w:tblBorders>
           <w:tblCellMar>
             <w:top w:w="0" w:type="dxa"/>
             <w:left w:w="108" w:type="dxa"/>
@@ -175,61 +165,59 @@
           </w:tblCellMar>
         </w:tblPrEx>
         <w:trPr>
+          <w:gridBefore w:val="1"/>
           <w:gridAfter w:val="1"/>
-          <w:wAfter w:w="283" w:type="dxa"/>
+          <w:wBefore w:w="176" w:type="dxa"/>
+          <w:wAfter w:w="674" w:type="dxa"/>
+          <w:jc w:val="center"/>
         </w:trPr>
         <w:tc>
           <w:tcPr>
-            <w:tcW w:w="3545" w:type="dxa"/>
-            <w:gridSpan w:val="3"/>
-            <w:tcBorders>
-              <w:top w:val="nil"/>
-              <w:left w:val="nil"/>
-              <w:bottom w:val="nil"/>
-              <w:right w:val="nil"/>
-            </w:tcBorders>
+            <w:tcW w:w="3686" w:type="dxa"/>
+            <w:gridSpan w:val="2"/>
             <w:noWrap w:val="0"/>
             <w:vAlign w:val="top"/>
           </w:tcPr>
           <w:p>
             <w:pPr>
+              <w:tabs>
+                <w:tab w:val="left" w:pos="630"/>
+              </w:tabs>
               <w:spacing w:line="360" w:lineRule="auto"/>
-              <w:ind w:left="142"/>
-              <w:rPr>
-                <w:lang w:val="fr-FR"/>
-              </w:rPr>
-            </w:pPr>
-            <w:r>
-              <w:rPr>
-                <w:lang w:val="fr-FR"/>
-              </w:rPr>
-              <w:t>Đơn vị</w:t>
+              <w:rPr>
+                <w:lang w:val="fr-FR"/>
+              </w:rPr>
+            </w:pPr>
+            <w:r>
+              <w:rPr>
+                <w:lang w:val="fr-FR"/>
+              </w:rPr>
+              <w:t xml:space="preserve">Đơn vị </w:t>
             </w:r>
           </w:p>
         </w:tc>
         <w:tc>
           <w:tcPr>
-            <w:tcW w:w="6662" w:type="dxa"/>
-            <w:gridSpan w:val="4"/>
-            <w:tcBorders>
-              <w:top w:val="nil"/>
-              <w:left w:val="nil"/>
-              <w:bottom w:val="nil"/>
-              <w:right w:val="nil"/>
-            </w:tcBorders>
+            <w:tcW w:w="5954" w:type="dxa"/>
+            <w:gridSpan w:val="3"/>
             <w:noWrap w:val="0"/>
             <w:vAlign w:val="top"/>
           </w:tcPr>
           <w:p>
             <w:pPr>
+              <w:tabs>
+                <w:tab w:val="left" w:pos="630"/>
+              </w:tabs>
               <w:spacing w:line="360" w:lineRule="auto"/>
               <w:rPr>
                 <w:rFonts w:hint="default" w:ascii="Times New Roman" w:hAnsi="Times New Roman" w:cs="Times New Roman"/>
+                <w:lang w:val="fr-FR"/>
               </w:rPr>
             </w:pPr>
             <w:r>
               <w:rPr>
                 <w:rFonts w:hint="default" w:ascii="Times New Roman" w:hAnsi="Times New Roman" w:cs="Times New Roman"/>
+                <w:lang w:val="fr-FR"/>
               </w:rPr>
               <w:t>:</w:t>
             </w:r>
@@ -253,14 +241,6 @@
       </w:tr>
       <w:tr>
         <w:tblPrEx>
-          <w:tblBorders>
-            <w:top w:val="single" w:color="auto" w:sz="4" w:space="0"/>
-            <w:left w:val="single" w:color="auto" w:sz="4" w:space="0"/>
-            <w:bottom w:val="single" w:color="auto" w:sz="4" w:space="0"/>
-            <w:right w:val="single" w:color="auto" w:sz="4" w:space="0"/>
-            <w:insideH w:val="single" w:color="auto" w:sz="4" w:space="0"/>
-            <w:insideV w:val="single" w:color="auto" w:sz="4" w:space="0"/>
-          </w:tblBorders>
           <w:tblCellMar>
             <w:top w:w="0" w:type="dxa"/>
             <w:left w:w="108" w:type="dxa"/>
@@ -269,53 +249,53 @@
           </w:tblCellMar>
         </w:tblPrEx>
         <w:trPr>
+          <w:gridBefore w:val="1"/>
           <w:gridAfter w:val="1"/>
-          <w:wAfter w:w="283" w:type="dxa"/>
+          <w:wBefore w:w="176" w:type="dxa"/>
+          <w:wAfter w:w="674" w:type="dxa"/>
+          <w:jc w:val="center"/>
         </w:trPr>
         <w:tc>
           <w:tcPr>
-            <w:tcW w:w="3545" w:type="dxa"/>
-            <w:gridSpan w:val="3"/>
-            <w:tcBorders>
-              <w:top w:val="nil"/>
-              <w:left w:val="nil"/>
-              <w:bottom w:val="nil"/>
-              <w:right w:val="nil"/>
-            </w:tcBorders>
+            <w:tcW w:w="3686" w:type="dxa"/>
+            <w:gridSpan w:val="2"/>
             <w:noWrap w:val="0"/>
             <w:vAlign w:val="top"/>
           </w:tcPr>
           <w:p>
             <w:pPr>
+              <w:tabs>
+                <w:tab w:val="left" w:pos="630"/>
+              </w:tabs>
               <w:spacing w:line="360" w:lineRule="auto"/>
-              <w:ind w:left="142"/>
-              <w:rPr>
-                <w:lang w:val="fr-FR"/>
-              </w:rPr>
-            </w:pPr>
-            <w:r>
-              <w:rPr>
-                <w:lang w:val="fr-FR"/>
-              </w:rPr>
-              <w:t>Đề nghị chuyển khoản số tiền</w:t>
+            </w:pPr>
+            <w:r>
+              <w:t xml:space="preserve">Đề nghị </w:t>
+            </w:r>
+            <w:r>
+              <w:rPr>
+                <w:rFonts w:hint="default"/>
+                <w:lang w:val="en-US"/>
+              </w:rPr>
+              <w:t>chuyển khoản</w:t>
+            </w:r>
+            <w:r>
+              <w:t xml:space="preserve"> số tiền</w:t>
             </w:r>
           </w:p>
         </w:tc>
         <w:tc>
           <w:tcPr>
-            <w:tcW w:w="6662" w:type="dxa"/>
-            <w:gridSpan w:val="4"/>
-            <w:tcBorders>
-              <w:top w:val="nil"/>
-              <w:left w:val="nil"/>
-              <w:bottom w:val="nil"/>
-              <w:right w:val="nil"/>
-            </w:tcBorders>
+            <w:tcW w:w="5954" w:type="dxa"/>
+            <w:gridSpan w:val="3"/>
             <w:noWrap w:val="0"/>
             <w:vAlign w:val="top"/>
           </w:tcPr>
           <w:p>
             <w:pPr>
+              <w:tabs>
+                <w:tab w:val="left" w:pos="630"/>
+              </w:tabs>
               <w:spacing w:line="360" w:lineRule="auto"/>
               <w:rPr>
                 <w:rFonts w:hint="default" w:ascii="Times New Roman" w:hAnsi="Times New Roman" w:cs="Times New Roman"/>
@@ -325,7 +305,6 @@
             <w:r>
               <w:rPr>
                 <w:rFonts w:hint="default" w:ascii="Times New Roman" w:hAnsi="Times New Roman" w:cs="Times New Roman"/>
-                <w:lang w:val="fr-FR"/>
               </w:rPr>
               <w:t>:</w:t>
             </w:r>
@@ -346,28 +325,29 @@
             </w:r>
             <w:r>
               <w:rPr>
-                <w:rFonts w:hint="default" w:cs="Times New Roman"/>
+                <w:rFonts w:hint="default" w:ascii="Times New Roman" w:hAnsi="Times New Roman" w:eastAsia="SimSun" w:cs="Times New Roman"/>
                 <w:sz w:val="24"/>
                 <w:szCs w:val="24"/>
                 <w:lang w:val="en-US"/>
               </w:rPr>
-              <w:t xml:space="preserve"> VNĐ</w:t>
-            </w:r>
-            <w:bookmarkStart w:id="0" w:name="_GoBack"/>
-            <w:bookmarkEnd w:id="0"/>
+              <w:t xml:space="preserve"> </w:t>
+            </w:r>
+            <w:r>
+              <w:rPr>
+                <w:rFonts w:hint="default" w:ascii="Times New Roman" w:hAnsi="Times New Roman" w:eastAsia="SimSun" w:cs="Times New Roman"/>
+                <w:b/>
+                <w:bCs/>
+                <w:sz w:val="24"/>
+                <w:szCs w:val="24"/>
+                <w:lang w:val="en-US"/>
+              </w:rPr>
+              <w:t>VNĐ</w:t>
+            </w:r>
           </w:p>
         </w:tc>
       </w:tr>
       <w:tr>
         <w:tblPrEx>
-          <w:tblBorders>
-            <w:top w:val="single" w:color="auto" w:sz="4" w:space="0"/>
-            <w:left w:val="single" w:color="auto" w:sz="4" w:space="0"/>
-            <w:bottom w:val="single" w:color="auto" w:sz="4" w:space="0"/>
-            <w:right w:val="single" w:color="auto" w:sz="4" w:space="0"/>
-            <w:insideH w:val="single" w:color="auto" w:sz="4" w:space="0"/>
-            <w:insideV w:val="single" w:color="auto" w:sz="4" w:space="0"/>
-          </w:tblBorders>
           <w:tblCellMar>
             <w:top w:w="0" w:type="dxa"/>
             <w:left w:w="108" w:type="dxa"/>
@@ -376,29 +356,27 @@
           </w:tblCellMar>
         </w:tblPrEx>
         <w:trPr>
+          <w:gridBefore w:val="1"/>
           <w:gridAfter w:val="1"/>
-          <w:wAfter w:w="283" w:type="dxa"/>
+          <w:wBefore w:w="176" w:type="dxa"/>
+          <w:wAfter w:w="674" w:type="dxa"/>
+          <w:trHeight w:val="396" w:hRule="atLeast"/>
+          <w:jc w:val="center"/>
         </w:trPr>
         <w:tc>
           <w:tcPr>
-            <w:tcW w:w="3545" w:type="dxa"/>
-            <w:gridSpan w:val="3"/>
-            <w:tcBorders>
-              <w:top w:val="nil"/>
-              <w:left w:val="nil"/>
-              <w:bottom w:val="nil"/>
-              <w:right w:val="nil"/>
-            </w:tcBorders>
+            <w:tcW w:w="3686" w:type="dxa"/>
+            <w:gridSpan w:val="2"/>
             <w:noWrap w:val="0"/>
             <w:vAlign w:val="top"/>
           </w:tcPr>
           <w:p>
             <w:pPr>
               <w:tabs>
+                <w:tab w:val="left" w:pos="630"/>
                 <w:tab w:val="left" w:pos="2835"/>
               </w:tabs>
               <w:spacing w:line="360" w:lineRule="auto"/>
-              <w:ind w:left="142"/>
               <w:rPr>
                 <w:lang w:val="fr-FR"/>
               </w:rPr>
@@ -413,19 +391,17 @@
         </w:tc>
         <w:tc>
           <w:tcPr>
-            <w:tcW w:w="6662" w:type="dxa"/>
-            <w:gridSpan w:val="4"/>
-            <w:tcBorders>
-              <w:top w:val="nil"/>
-              <w:left w:val="nil"/>
-              <w:bottom w:val="nil"/>
-              <w:right w:val="nil"/>
-            </w:tcBorders>
+            <w:tcW w:w="5954" w:type="dxa"/>
+            <w:gridSpan w:val="3"/>
             <w:noWrap w:val="0"/>
             <w:vAlign w:val="top"/>
           </w:tcPr>
           <w:p>
             <w:pPr>
+              <w:tabs>
+                <w:tab w:val="left" w:pos="630"/>
+                <w:tab w:val="left" w:pos="2835"/>
+              </w:tabs>
               <w:spacing w:line="360" w:lineRule="auto"/>
               <w:rPr>
                 <w:rFonts w:hint="default" w:ascii="Times New Roman" w:hAnsi="Times New Roman" w:cs="Times New Roman"/>
@@ -459,14 +435,6 @@
       </w:tr>
       <w:tr>
         <w:tblPrEx>
-          <w:tblBorders>
-            <w:top w:val="single" w:color="auto" w:sz="4" w:space="0"/>
-            <w:left w:val="single" w:color="auto" w:sz="4" w:space="0"/>
-            <w:bottom w:val="single" w:color="auto" w:sz="4" w:space="0"/>
-            <w:right w:val="single" w:color="auto" w:sz="4" w:space="0"/>
-            <w:insideH w:val="single" w:color="auto" w:sz="4" w:space="0"/>
-            <w:insideV w:val="single" w:color="auto" w:sz="4" w:space="0"/>
-          </w:tblBorders>
           <w:tblCellMar>
             <w:top w:w="0" w:type="dxa"/>
             <w:left w:w="108" w:type="dxa"/>
@@ -475,54 +443,64 @@
           </w:tblCellMar>
         </w:tblPrEx>
         <w:trPr>
+          <w:gridBefore w:val="1"/>
           <w:gridAfter w:val="1"/>
-          <w:wAfter w:w="283" w:type="dxa"/>
-          <w:trHeight w:val="661" w:hRule="atLeast"/>
+          <w:wBefore w:w="176" w:type="dxa"/>
+          <w:wAfter w:w="674" w:type="dxa"/>
+          <w:trHeight w:val="468" w:hRule="atLeast"/>
+          <w:jc w:val="center"/>
         </w:trPr>
         <w:tc>
           <w:tcPr>
-            <w:tcW w:w="3545" w:type="dxa"/>
-            <w:gridSpan w:val="3"/>
-            <w:tcBorders>
-              <w:top w:val="nil"/>
-              <w:left w:val="nil"/>
-              <w:bottom w:val="nil"/>
-              <w:right w:val="nil"/>
-            </w:tcBorders>
+            <w:tcW w:w="3686" w:type="dxa"/>
+            <w:gridSpan w:val="2"/>
             <w:noWrap w:val="0"/>
             <w:vAlign w:val="top"/>
           </w:tcPr>
           <w:p>
             <w:pPr>
+              <w:tabs>
+                <w:tab w:val="left" w:pos="630"/>
+              </w:tabs>
               <w:spacing w:line="360" w:lineRule="auto"/>
-              <w:ind w:left="142"/>
-              <w:rPr>
-                <w:lang w:val="fr-FR"/>
-              </w:rPr>
-            </w:pPr>
-            <w:r>
-              <w:rPr>
-                <w:lang w:val="fr-FR"/>
-              </w:rPr>
-              <w:t>Lý do chuyển khoản</w:t>
+              <w:rPr>
+                <w:lang w:val="fr-FR"/>
+              </w:rPr>
+            </w:pPr>
+            <w:r>
+              <w:rPr>
+                <w:lang w:val="fr-FR"/>
+              </w:rPr>
+              <w:t xml:space="preserve">Lý do </w:t>
+            </w:r>
+            <w:r>
+              <w:rPr>
+                <w:rFonts w:hint="default"/>
+                <w:lang w:val="en-US"/>
+              </w:rPr>
+              <w:t>chuyển khoản</w:t>
+            </w:r>
+            <w:r>
+              <w:rPr>
+                <w:lang w:val="fr-FR"/>
+              </w:rPr>
+              <w:t xml:space="preserve"> </w:t>
             </w:r>
           </w:p>
         </w:tc>
         <w:tc>
           <w:tcPr>
-            <w:tcW w:w="6662" w:type="dxa"/>
-            <w:gridSpan w:val="4"/>
-            <w:tcBorders>
-              <w:top w:val="nil"/>
-              <w:left w:val="nil"/>
-              <w:bottom w:val="nil"/>
-              <w:right w:val="nil"/>
-            </w:tcBorders>
+            <w:tcW w:w="5954" w:type="dxa"/>
+            <w:gridSpan w:val="3"/>
             <w:noWrap w:val="0"/>
             <w:vAlign w:val="top"/>
           </w:tcPr>
           <w:p>
             <w:pPr>
+              <w:tabs>
+                <w:tab w:val="left" w:pos="630"/>
+              </w:tabs>
+              <w:spacing w:line="360" w:lineRule="auto"/>
               <w:rPr>
                 <w:rFonts w:hint="default" w:ascii="Times New Roman" w:hAnsi="Times New Roman" w:cs="Times New Roman"/>
                 <w:lang w:val="fr-FR"/>
@@ -534,20 +512,27 @@
                 <w:lang w:val="fr-FR"/>
               </w:rPr>
               <w:t>:</w:t>
+            </w:r>
+            <w:r>
+              <w:rPr>
+                <w:rFonts w:hint="default" w:ascii="Times New Roman" w:hAnsi="Times New Roman" w:cs="Times New Roman"/>
+                <w:lang w:val="en-US"/>
+              </w:rPr>
+              <w:t xml:space="preserve"> </w:t>
+            </w:r>
+            <w:r>
+              <w:rPr>
+                <w:rFonts w:hint="default" w:ascii="Times New Roman" w:hAnsi="Times New Roman" w:eastAsia="SimSun" w:cs="Times New Roman"/>
+                <w:sz w:val="24"/>
+                <w:szCs w:val="24"/>
+              </w:rPr>
+              <w:t>{ly_do_de_nghi}</w:t>
             </w:r>
           </w:p>
         </w:tc>
       </w:tr>
       <w:tr>
         <w:tblPrEx>
-          <w:tblBorders>
-            <w:top w:val="single" w:color="auto" w:sz="4" w:space="0"/>
-            <w:left w:val="single" w:color="auto" w:sz="4" w:space="0"/>
-            <w:bottom w:val="single" w:color="auto" w:sz="4" w:space="0"/>
-            <w:right w:val="single" w:color="auto" w:sz="4" w:space="0"/>
-            <w:insideH w:val="single" w:color="auto" w:sz="4" w:space="0"/>
-            <w:insideV w:val="single" w:color="auto" w:sz="4" w:space="0"/>
-          </w:tblBorders>
           <w:tblCellMar>
             <w:top w:w="0" w:type="dxa"/>
             <w:left w:w="108" w:type="dxa"/>
@@ -555,68 +540,250 @@
             <w:right w:w="108" w:type="dxa"/>
           </w:tblCellMar>
         </w:tblPrEx>
+        <w:trPr>
+          <w:gridBefore w:val="1"/>
+          <w:gridAfter w:val="1"/>
+          <w:wBefore w:w="176" w:type="dxa"/>
+          <w:wAfter w:w="674" w:type="dxa"/>
+          <w:jc w:val="center"/>
+        </w:trPr>
         <w:tc>
           <w:tcPr>
-            <w:tcW w:w="3402" w:type="dxa"/>
+            <w:tcW w:w="3686" w:type="dxa"/>
+            <w:gridSpan w:val="2"/>
+            <w:shd w:val="clear" w:color="auto" w:fill="auto"/>
+            <w:noWrap w:val="0"/>
+            <w:vAlign w:val="top"/>
+          </w:tcPr>
+          <w:p>
+            <w:pPr>
+              <w:spacing w:line="312" w:lineRule="auto"/>
+              <w:rPr>
+                <w:rFonts w:ascii="Times New Roman" w:hAnsi="Times New Roman" w:eastAsia="Times New Roman" w:cs="Times New Roman"/>
+                <w:sz w:val="24"/>
+                <w:szCs w:val="24"/>
+                <w:lang w:val="fr-FR" w:eastAsia="en-US" w:bidi="ar-SA"/>
+              </w:rPr>
+            </w:pPr>
+            <w:r>
+              <w:rPr>
+                <w:lang w:val="fr-FR"/>
+              </w:rPr>
+              <w:t xml:space="preserve">Tên đơn vị thụ hưởng </w:t>
+            </w:r>
+          </w:p>
+        </w:tc>
+        <w:tc>
+          <w:tcPr>
+            <w:tcW w:w="5954" w:type="dxa"/>
+            <w:gridSpan w:val="3"/>
+            <w:shd w:val="clear" w:color="auto" w:fill="auto"/>
+            <w:noWrap w:val="0"/>
+            <w:vAlign w:val="top"/>
+          </w:tcPr>
+          <w:p>
+            <w:pPr>
+              <w:tabs>
+                <w:tab w:val="left" w:pos="630"/>
+              </w:tabs>
+              <w:spacing w:line="360" w:lineRule="auto"/>
+              <w:rPr>
+                <w:rFonts w:hint="default" w:ascii="Times New Roman" w:hAnsi="Times New Roman" w:eastAsia="Times New Roman" w:cs="Times New Roman"/>
+                <w:sz w:val="24"/>
+                <w:szCs w:val="24"/>
+                <w:lang w:val="fr-FR" w:eastAsia="en-US" w:bidi="ar-SA"/>
+              </w:rPr>
+            </w:pPr>
+            <w:r>
+              <w:rPr>
+                <w:rFonts w:hint="default" w:ascii="Times New Roman" w:hAnsi="Times New Roman" w:cs="Times New Roman"/>
+                <w:lang w:val="fr-FR"/>
+              </w:rPr>
+              <w:t>:</w:t>
+            </w:r>
+            <w:r>
+              <w:rPr>
+                <w:rFonts w:hint="default" w:ascii="Times New Roman" w:hAnsi="Times New Roman" w:cs="Times New Roman"/>
+                <w:lang w:val="en-US"/>
+              </w:rPr>
+              <w:t xml:space="preserve"> </w:t>
+            </w:r>
+            <w:r>
+              <w:rPr>
+                <w:rFonts w:hint="default" w:ascii="Times New Roman" w:hAnsi="Times New Roman" w:eastAsia="SimSun" w:cs="Times New Roman"/>
+                <w:sz w:val="24"/>
+                <w:szCs w:val="24"/>
+              </w:rPr>
+              <w:t>{ten_cong_ty}</w:t>
+            </w:r>
+          </w:p>
+        </w:tc>
+      </w:tr>
+      <w:tr>
+        <w:tblPrEx>
+          <w:tblCellMar>
+            <w:top w:w="0" w:type="dxa"/>
+            <w:left w:w="108" w:type="dxa"/>
+            <w:bottom w:w="0" w:type="dxa"/>
+            <w:right w:w="108" w:type="dxa"/>
+          </w:tblCellMar>
+        </w:tblPrEx>
+        <w:trPr>
+          <w:gridBefore w:val="1"/>
+          <w:gridAfter w:val="1"/>
+          <w:wBefore w:w="176" w:type="dxa"/>
+          <w:wAfter w:w="674" w:type="dxa"/>
+          <w:jc w:val="center"/>
+        </w:trPr>
+        <w:tc>
+          <w:tcPr>
+            <w:tcW w:w="3686" w:type="dxa"/>
+            <w:gridSpan w:val="2"/>
+            <w:noWrap w:val="0"/>
+            <w:vAlign w:val="top"/>
+          </w:tcPr>
+          <w:p>
+            <w:pPr>
+              <w:spacing w:line="312" w:lineRule="auto"/>
+              <w:rPr>
+                <w:lang w:val="fr-FR"/>
+              </w:rPr>
+            </w:pPr>
+            <w:r>
+              <w:rPr>
+                <w:lang w:val="fr-FR"/>
+              </w:rPr>
+              <w:t>Số tài khoản</w:t>
+            </w:r>
+          </w:p>
+        </w:tc>
+        <w:tc>
+          <w:tcPr>
+            <w:tcW w:w="5954" w:type="dxa"/>
+            <w:gridSpan w:val="3"/>
+            <w:noWrap w:val="0"/>
+            <w:vAlign w:val="top"/>
+          </w:tcPr>
+          <w:p>
+            <w:pPr>
+              <w:tabs>
+                <w:tab w:val="left" w:pos="630"/>
+              </w:tabs>
+              <w:spacing w:line="360" w:lineRule="auto"/>
+              <w:rPr>
+                <w:rFonts w:hint="default" w:ascii="Times New Roman" w:hAnsi="Times New Roman" w:cs="Times New Roman"/>
+                <w:lang w:val="fr-FR"/>
+              </w:rPr>
+            </w:pPr>
+            <w:r>
+              <w:rPr>
+                <w:rFonts w:hint="default" w:ascii="Times New Roman" w:hAnsi="Times New Roman" w:cs="Times New Roman"/>
+                <w:lang w:val="fr-FR"/>
+              </w:rPr>
+              <w:t>:</w:t>
+            </w:r>
+            <w:r>
+              <w:rPr>
+                <w:rFonts w:hint="default" w:ascii="Times New Roman" w:hAnsi="Times New Roman" w:cs="Times New Roman"/>
+                <w:lang w:val="en-US"/>
+              </w:rPr>
+              <w:t xml:space="preserve"> </w:t>
+            </w:r>
+            <w:r>
+              <w:rPr>
+                <w:rFonts w:hint="default" w:ascii="Times New Roman" w:hAnsi="Times New Roman" w:eastAsia="SimSun" w:cs="Times New Roman"/>
+                <w:sz w:val="24"/>
+                <w:szCs w:val="24"/>
+              </w:rPr>
+              <w:t>{so_tai_khoan}</w:t>
+            </w:r>
+          </w:p>
+        </w:tc>
+      </w:tr>
+      <w:tr>
+        <w:tblPrEx>
+          <w:tblCellMar>
+            <w:top w:w="0" w:type="dxa"/>
+            <w:left w:w="108" w:type="dxa"/>
+            <w:bottom w:w="0" w:type="dxa"/>
+            <w:right w:w="108" w:type="dxa"/>
+          </w:tblCellMar>
+        </w:tblPrEx>
+        <w:trPr>
+          <w:gridBefore w:val="1"/>
+          <w:gridAfter w:val="1"/>
+          <w:wBefore w:w="176" w:type="dxa"/>
+          <w:wAfter w:w="674" w:type="dxa"/>
+          <w:jc w:val="center"/>
+        </w:trPr>
+        <w:tc>
+          <w:tcPr>
+            <w:tcW w:w="3686" w:type="dxa"/>
             <w:gridSpan w:val="2"/>
             <w:tcBorders>
-              <w:top w:val="nil"/>
-              <w:left w:val="nil"/>
               <w:bottom w:val="single" w:color="auto" w:sz="4" w:space="0"/>
-              <w:right w:val="nil"/>
             </w:tcBorders>
             <w:noWrap w:val="0"/>
             <w:vAlign w:val="top"/>
           </w:tcPr>
           <w:p>
             <w:pPr>
-              <w:rPr>
-                <w:lang w:val="fr-FR"/>
-              </w:rPr>
-            </w:pPr>
+              <w:spacing w:line="312" w:lineRule="auto"/>
+              <w:rPr>
+                <w:lang w:val="fr-FR"/>
+              </w:rPr>
+            </w:pPr>
+            <w:r>
+              <w:rPr>
+                <w:lang w:val="fr-FR"/>
+              </w:rPr>
+              <w:t>Tại ngân hàng</w:t>
+            </w:r>
           </w:p>
         </w:tc>
         <w:tc>
           <w:tcPr>
-            <w:tcW w:w="3545" w:type="dxa"/>
+            <w:tcW w:w="5954" w:type="dxa"/>
             <w:gridSpan w:val="3"/>
             <w:tcBorders>
-              <w:top w:val="nil"/>
-              <w:left w:val="nil"/>
               <w:bottom w:val="single" w:color="auto" w:sz="4" w:space="0"/>
-              <w:right w:val="nil"/>
             </w:tcBorders>
             <w:noWrap w:val="0"/>
             <w:vAlign w:val="top"/>
           </w:tcPr>
           <w:p>
             <w:pPr>
-              <w:rPr>
-                <w:lang w:val="fr-FR"/>
-              </w:rPr>
-            </w:pPr>
-          </w:p>
-        </w:tc>
-        <w:tc>
-          <w:tcPr>
-            <w:tcW w:w="3543" w:type="dxa"/>
-            <w:gridSpan w:val="3"/>
-            <w:tcBorders>
-              <w:top w:val="nil"/>
-              <w:left w:val="nil"/>
-              <w:bottom w:val="single" w:color="auto" w:sz="4" w:space="0"/>
-              <w:right w:val="nil"/>
-            </w:tcBorders>
-            <w:noWrap w:val="0"/>
-            <w:vAlign w:val="top"/>
-          </w:tcPr>
-          <w:p>
-            <w:pPr>
-              <w:rPr>
-                <w:sz w:val="26"/>
-                <w:szCs w:val="26"/>
-              </w:rPr>
-            </w:pPr>
+              <w:tabs>
+                <w:tab w:val="left" w:pos="630"/>
+              </w:tabs>
+              <w:spacing w:line="360" w:lineRule="auto"/>
+              <w:rPr>
+                <w:rFonts w:hint="default" w:ascii="Times New Roman" w:hAnsi="Times New Roman" w:cs="Times New Roman"/>
+                <w:lang w:val="fr-FR"/>
+              </w:rPr>
+            </w:pPr>
+            <w:r>
+              <w:rPr>
+                <w:rFonts w:hint="default" w:ascii="Times New Roman" w:hAnsi="Times New Roman" w:cs="Times New Roman"/>
+                <w:lang w:val="fr-FR"/>
+              </w:rPr>
+              <w:t>:</w:t>
+            </w:r>
+            <w:r>
+              <w:rPr>
+                <w:rFonts w:hint="default" w:ascii="Times New Roman" w:hAnsi="Times New Roman" w:cs="Times New Roman"/>
+                <w:lang w:val="en-US"/>
+              </w:rPr>
+              <w:t xml:space="preserve"> </w:t>
+            </w:r>
+            <w:r>
+              <w:rPr>
+                <w:rFonts w:hint="default" w:ascii="Times New Roman" w:hAnsi="Times New Roman" w:eastAsia="SimSun" w:cs="Times New Roman"/>
+                <w:sz w:val="24"/>
+                <w:szCs w:val="24"/>
+              </w:rPr>
+              <w:t>{ten_ngan_hang}</w:t>
+            </w:r>
           </w:p>
         </w:tc>
       </w:tr>
@@ -643,6 +810,7 @@
         <w:tc>
           <w:tcPr>
             <w:tcW w:w="2411" w:type="dxa"/>
+            <w:gridSpan w:val="2"/>
             <w:tcBorders>
               <w:top w:val="single" w:color="auto" w:sz="4" w:space="0"/>
               <w:left w:val="single" w:color="auto" w:sz="4" w:space="0"/>
@@ -771,7 +939,7 @@
         <w:tc>
           <w:tcPr>
             <w:tcW w:w="2551" w:type="dxa"/>
-            <w:gridSpan w:val="3"/>
+            <w:gridSpan w:val="2"/>
             <w:tcBorders>
               <w:top w:val="single" w:color="auto" w:sz="4" w:space="0"/>
               <w:left w:val="single" w:color="auto" w:sz="4" w:space="0"/>
@@ -810,7 +978,6 @@
         <w:tc>
           <w:tcPr>
             <w:tcW w:w="2835" w:type="dxa"/>
-            <w:gridSpan w:val="2"/>
             <w:tcBorders>
               <w:top w:val="single" w:color="auto" w:sz="4" w:space="0"/>
               <w:left w:val="single" w:color="auto" w:sz="4" w:space="0"/>
@@ -1070,6 +1237,7 @@
         <w:tc>
           <w:tcPr>
             <w:tcW w:w="2411" w:type="dxa"/>
+            <w:gridSpan w:val="2"/>
             <w:tcBorders>
               <w:top w:val="single" w:color="auto" w:sz="4" w:space="0"/>
             </w:tcBorders>
@@ -1083,57 +1251,26 @@
               <w:rPr>
                 <w:rFonts w:hint="default"/>
                 <w:i/>
+                <w:iCs/>
                 <w:lang w:val="en-US"/>
               </w:rPr>
             </w:pPr>
             <w:r>
               <w:rPr>
                 <w:rFonts w:hint="default" w:cs="Times New Roman"/>
+                <w:i/>
+                <w:iCs/>
                 <w:sz w:val="24"/>
                 <w:szCs w:val="24"/>
                 <w:lang w:val="en-US"/>
               </w:rPr>
-              <w:t>.../.../20...</w:t>
+              <w:t>Ngày.../.../20...</w:t>
             </w:r>
           </w:p>
         </w:tc>
         <w:tc>
           <w:tcPr>
             <w:tcW w:w="2551" w:type="dxa"/>
-            <w:gridSpan w:val="3"/>
-            <w:tcBorders>
-              <w:top w:val="single" w:color="auto" w:sz="4" w:space="0"/>
-            </w:tcBorders>
-            <w:shd w:val="clear" w:color="auto" w:fill="auto"/>
-            <w:noWrap w:val="0"/>
-            <w:vAlign w:val="top"/>
-          </w:tcPr>
-          <w:p>
-            <w:pPr>
-              <w:spacing w:line="360" w:lineRule="auto"/>
-              <w:jc w:val="center"/>
-              <w:rPr>
-                <w:rFonts w:hint="default" w:ascii="Times New Roman" w:hAnsi="Times New Roman" w:eastAsia="SimSun" w:cs="Times New Roman"/>
-                <w:i/>
-                <w:sz w:val="24"/>
-                <w:szCs w:val="24"/>
-                <w:lang w:val="fr-FR" w:eastAsia="en-US" w:bidi="ar-SA"/>
-              </w:rPr>
-            </w:pPr>
-            <w:r>
-              <w:rPr>
-                <w:rFonts w:hint="default" w:cs="Times New Roman"/>
-                <w:sz w:val="24"/>
-                <w:szCs w:val="24"/>
-                <w:lang w:val="en-US"/>
-              </w:rPr>
-              <w:t>.../.../20...</w:t>
-            </w:r>
-          </w:p>
-        </w:tc>
-        <w:tc>
-          <w:tcPr>
-            <w:tcW w:w="2835" w:type="dxa"/>
             <w:gridSpan w:val="2"/>
             <w:tcBorders>
               <w:top w:val="single" w:color="auto" w:sz="4" w:space="0"/>
@@ -1149,6 +1286,7 @@
               <w:rPr>
                 <w:rFonts w:hint="default" w:ascii="Times New Roman" w:hAnsi="Times New Roman" w:eastAsia="SimSun" w:cs="Times New Roman"/>
                 <w:i/>
+                <w:iCs/>
                 <w:sz w:val="24"/>
                 <w:szCs w:val="24"/>
                 <w:lang w:val="fr-FR" w:eastAsia="en-US" w:bidi="ar-SA"/>
@@ -1157,11 +1295,49 @@
             <w:r>
               <w:rPr>
                 <w:rFonts w:hint="default" w:cs="Times New Roman"/>
+                <w:i/>
+                <w:iCs/>
                 <w:sz w:val="24"/>
                 <w:szCs w:val="24"/>
                 <w:lang w:val="en-US"/>
               </w:rPr>
-              <w:t>.../.../20...</w:t>
+              <w:t>Ngày.../.../20...</w:t>
+            </w:r>
+          </w:p>
+        </w:tc>
+        <w:tc>
+          <w:tcPr>
+            <w:tcW w:w="2835" w:type="dxa"/>
+            <w:tcBorders>
+              <w:top w:val="single" w:color="auto" w:sz="4" w:space="0"/>
+            </w:tcBorders>
+            <w:shd w:val="clear" w:color="auto" w:fill="auto"/>
+            <w:noWrap w:val="0"/>
+            <w:vAlign w:val="top"/>
+          </w:tcPr>
+          <w:p>
+            <w:pPr>
+              <w:spacing w:line="360" w:lineRule="auto"/>
+              <w:jc w:val="center"/>
+              <w:rPr>
+                <w:rFonts w:hint="default" w:ascii="Times New Roman" w:hAnsi="Times New Roman" w:eastAsia="SimSun" w:cs="Times New Roman"/>
+                <w:i/>
+                <w:iCs/>
+                <w:sz w:val="24"/>
+                <w:szCs w:val="24"/>
+                <w:lang w:val="fr-FR" w:eastAsia="en-US" w:bidi="ar-SA"/>
+              </w:rPr>
+            </w:pPr>
+            <w:r>
+              <w:rPr>
+                <w:rFonts w:hint="default" w:cs="Times New Roman"/>
+                <w:i/>
+                <w:iCs/>
+                <w:sz w:val="24"/>
+                <w:szCs w:val="24"/>
+                <w:lang w:val="en-US"/>
+              </w:rPr>
+              <w:t>Ngày.../.../20...</w:t>
             </w:r>
           </w:p>
         </w:tc>
@@ -1183,6 +1359,7 @@
               <w:rPr>
                 <w:rFonts w:hint="default" w:ascii="Times New Roman" w:hAnsi="Times New Roman" w:eastAsia="SimSun" w:cs="Times New Roman"/>
                 <w:i/>
+                <w:iCs/>
                 <w:sz w:val="24"/>
                 <w:szCs w:val="24"/>
                 <w:lang w:val="fr-FR" w:eastAsia="en-US" w:bidi="ar-SA"/>
@@ -1191,24 +1368,19 @@
             <w:r>
               <w:rPr>
                 <w:rFonts w:hint="default" w:cs="Times New Roman"/>
+                <w:i/>
+                <w:iCs/>
                 <w:sz w:val="24"/>
                 <w:szCs w:val="24"/>
                 <w:lang w:val="en-US"/>
               </w:rPr>
-              <w:t>.../.../20...</w:t>
+              <w:t>Ngày.../.../20...</w:t>
             </w:r>
           </w:p>
         </w:tc>
       </w:tr>
     </w:tbl>
-    <w:p>
-      <w:pPr>
-        <w:ind w:left="142"/>
-        <w:rPr>
-          <w:lang w:val="fr-FR"/>
-        </w:rPr>
-      </w:pPr>
-    </w:p>
+    <w:p/>
     <w:p>
       <w:pPr>
         <w:rPr>
@@ -1229,6 +1401,8 @@
           <w:lang w:val="fr-FR"/>
         </w:rPr>
       </w:pPr>
+      <w:bookmarkStart w:id="0" w:name="_GoBack"/>
+      <w:bookmarkEnd w:id="0"/>
     </w:p>
     <w:p>
       <w:pPr>

</xml_diff>